<commit_message>
Form Validation Check-ups + Avatar Preloading
</commit_message>
<xml_diff>
--- a/memoria_proyecto.docx
+++ b/memoria_proyecto.docx
@@ -52,7 +52,7 @@
                     </pic:cNvPicPr>
                   </pic:nvPicPr>
                   <pic:blipFill>
-                    <a:blip r:embed="rId5">
+                    <a:blip r:embed="rId8">
                       <a:extLst>
                         <a:ext uri="{28A0092B-C50C-407E-A947-70E740481C1C}">
                           <a14:useLocalDpi xmlns:a14="http://schemas.microsoft.com/office/drawing/2010/main" val="0"/>
@@ -129,7 +129,7 @@
         <w:rPr>
           <w:rFonts w:ascii="Times New Roman" w:hAnsi="Times New Roman" w:cs="Times New Roman"/>
         </w:rPr>
-        <w:t>Marzo</w:t>
+        <w:t>Abril</w:t>
       </w:r>
       <w:r>
         <w:rPr>
@@ -155,7 +155,19 @@
         <w:rPr>
           <w:rFonts w:ascii="Times New Roman" w:hAnsi="Times New Roman" w:cs="Times New Roman"/>
         </w:rPr>
-        <w:t> 2.0</w:t>
+        <w:t> </w:t>
+      </w:r>
+      <w:r>
+        <w:rPr>
+          <w:rFonts w:ascii="Times New Roman" w:hAnsi="Times New Roman" w:cs="Times New Roman"/>
+        </w:rPr>
+        <w:t>3</w:t>
+      </w:r>
+      <w:r>
+        <w:rPr>
+          <w:rFonts w:ascii="Times New Roman" w:hAnsi="Times New Roman" w:cs="Times New Roman"/>
+        </w:rPr>
+        <w:t>.0</w:t>
       </w:r>
       <w:r>
         <w:rPr>
@@ -806,6 +818,19 @@
         <w:rPr>
           <w:rFonts w:ascii="Times New Roman" w:hAnsi="Times New Roman" w:cs="Times New Roman"/>
         </w:rPr>
+        <w:sectPr>
+          <w:headerReference w:type="even" r:id="rId9"/>
+          <w:headerReference w:type="default" r:id="rId10"/>
+          <w:footerReference w:type="even" r:id="rId11"/>
+          <w:footerReference w:type="default" r:id="rId12"/>
+          <w:headerReference w:type="first" r:id="rId13"/>
+          <w:footerReference w:type="first" r:id="rId14"/>
+          <w:pgSz w:w="11906" w:h="16838"/>
+          <w:pgMar w:top="1417" w:right="1701" w:bottom="1417" w:left="1701" w:header="708" w:footer="708" w:gutter="0"/>
+          <w:pgNumType w:start="1"/>
+          <w:cols w:space="708"/>
+          <w:docGrid w:linePitch="360"/>
+        </w:sectPr>
       </w:pPr>
       <w:r>
         <w:rPr>
@@ -848,35 +873,34 @@
           <w:rFonts w:ascii="Times New Roman" w:hAnsi="Times New Roman" w:cs="Times New Roman"/>
         </w:rPr>
         <w:br/>
-        <w:t>Anexo E: Guía de despliegue en producción</w:t>
-      </w:r>
-    </w:p>
-    <w:p>
-      <w:pPr>
-        <w:rPr>
-          <w:rFonts w:ascii="Times New Roman" w:hAnsi="Times New Roman" w:cs="Times New Roman"/>
-        </w:rPr>
-      </w:pPr>
-      <w:r>
-        <w:rPr>
-          <w:rFonts w:ascii="Times New Roman" w:hAnsi="Times New Roman" w:cs="Times New Roman"/>
-        </w:rPr>
-        <w:br w:type="page"/>
-      </w:r>
-    </w:p>
-    <w:p>
-      <w:pPr>
-        <w:rPr>
-          <w:rFonts w:ascii="Times New Roman" w:hAnsi="Times New Roman" w:cs="Times New Roman"/>
-        </w:rPr>
-      </w:pPr>
-      <w:r>
-        <w:rPr>
-          <w:rFonts w:ascii="Times New Roman" w:hAnsi="Times New Roman" w:cs="Times New Roman"/>
-        </w:rPr>
-        <w:lastRenderedPageBreak/>
+        <w:t>Anexo E: Guía de despliegue en producció</w:t>
+      </w:r>
+      <w:r>
+        <w:rPr>
+          <w:rFonts w:ascii="Times New Roman" w:hAnsi="Times New Roman" w:cs="Times New Roman"/>
+        </w:rPr>
+        <w:t>n</w:t>
+      </w:r>
+    </w:p>
+    <w:p>
+      <w:pPr>
+        <w:rPr>
+          <w:rFonts w:ascii="Times New Roman" w:hAnsi="Times New Roman" w:cs="Times New Roman"/>
+        </w:rPr>
+      </w:pPr>
+    </w:p>
+    <w:p>
+      <w:pPr>
+        <w:rPr>
+          <w:rFonts w:ascii="Times New Roman" w:hAnsi="Times New Roman" w:cs="Times New Roman"/>
+        </w:rPr>
+      </w:pPr>
+      <w:r>
+        <w:rPr>
+          <w:rFonts w:ascii="Times New Roman" w:hAnsi="Times New Roman" w:cs="Times New Roman"/>
+        </w:rPr>
         <w:pict w14:anchorId="143AF409">
-          <v:rect id="_x0000_i1028" style="width:0;height:.75pt" o:hralign="center" o:hrstd="t" o:hr="t" fillcolor="#a0a0a0" stroked="f"/>
+          <v:rect id="_x0000_i1061" style="width:0;height:.75pt" o:hralign="center" o:hrstd="t" o:hr="t" fillcolor="#a0a0a0" stroked="f"/>
         </w:pict>
       </w:r>
     </w:p>
@@ -1204,7 +1228,6 @@
           <w:b/>
           <w:bCs/>
         </w:rPr>
-        <w:lastRenderedPageBreak/>
         <w:t>1.4 Objetivos del proyecto</w:t>
       </w:r>
     </w:p>
@@ -2273,7 +2296,7 @@
         </w:rPr>
         <w:lastRenderedPageBreak/>
         <w:pict w14:anchorId="7BDDA582">
-          <v:rect id="_x0000_i1029" style="width:0;height:.75pt" o:hralign="center" o:bullet="t" o:hrstd="t" o:hr="t" fillcolor="#a0a0a0" stroked="f"/>
+          <v:rect id="_x0000_i1053" style="width:0;height:.75pt" o:hralign="center" o:bullet="t" o:hrstd="t" o:hr="t" fillcolor="#a0a0a0" stroked="f"/>
         </w:pict>
       </w:r>
     </w:p>
@@ -7861,7 +7884,7 @@
         </w:rPr>
         <w:lastRenderedPageBreak/>
         <w:pict w14:anchorId="47A1A2AB">
-          <v:rect id="_x0000_i1030" style="width:0;height:.75pt" o:hralign="center" o:bullet="t" o:hrstd="t" o:hr="t" fillcolor="#a0a0a0" stroked="f"/>
+          <v:rect id="_x0000_i1054" style="width:0;height:.75pt" o:hralign="center" o:bullet="t" o:hrstd="t" o:hr="t" fillcolor="#a0a0a0" stroked="f"/>
         </w:pict>
       </w:r>
     </w:p>
@@ -7946,6 +7969,7 @@
       <w:r>
         <w:rPr>
           <w:rFonts w:ascii="Times New Roman" w:hAnsi="Times New Roman" w:cs="Times New Roman"/>
+          <w:noProof/>
         </w:rPr>
         <w:drawing>
           <wp:inline distT="0" distB="0" distL="0" distR="0" wp14:anchorId="0E722B15" wp14:editId="124E5DA3">
@@ -7963,7 +7987,7 @@
                     <pic:cNvPicPr/>
                   </pic:nvPicPr>
                   <pic:blipFill>
-                    <a:blip r:embed="rId6"/>
+                    <a:blip r:embed="rId15"/>
                     <a:stretch>
                       <a:fillRect/>
                     </a:stretch>
@@ -8051,6 +8075,7 @@
       <w:r>
         <w:rPr>
           <w:rFonts w:ascii="Times New Roman" w:hAnsi="Times New Roman" w:cs="Times New Roman"/>
+          <w:noProof/>
         </w:rPr>
         <w:lastRenderedPageBreak/>
         <w:drawing>
@@ -8069,7 +8094,7 @@
                     <pic:cNvPicPr/>
                   </pic:nvPicPr>
                   <pic:blipFill>
-                    <a:blip r:embed="rId7"/>
+                    <a:blip r:embed="rId16"/>
                     <a:stretch>
                       <a:fillRect/>
                     </a:stretch>
@@ -8099,6 +8124,7 @@
       <w:r>
         <w:rPr>
           <w:rFonts w:ascii="Times New Roman" w:hAnsi="Times New Roman" w:cs="Times New Roman"/>
+          <w:noProof/>
         </w:rPr>
         <w:drawing>
           <wp:inline distT="0" distB="0" distL="0" distR="0" wp14:anchorId="2AF0BC85" wp14:editId="3DE7C69F">
@@ -8116,7 +8142,7 @@
                     <pic:cNvPicPr/>
                   </pic:nvPicPr>
                   <pic:blipFill>
-                    <a:blip r:embed="rId8"/>
+                    <a:blip r:embed="rId17"/>
                     <a:stretch>
                       <a:fillRect/>
                     </a:stretch>
@@ -8306,6 +8332,7 @@
       <w:r>
         <w:rPr>
           <w:rFonts w:ascii="Times New Roman" w:hAnsi="Times New Roman" w:cs="Times New Roman"/>
+          <w:noProof/>
         </w:rPr>
         <w:lastRenderedPageBreak/>
         <w:drawing>
@@ -8324,7 +8351,7 @@
                     <pic:cNvPicPr/>
                   </pic:nvPicPr>
                   <pic:blipFill>
-                    <a:blip r:embed="rId9"/>
+                    <a:blip r:embed="rId18"/>
                     <a:stretch>
                       <a:fillRect/>
                     </a:stretch>
@@ -8354,6 +8381,7 @@
       <w:r>
         <w:rPr>
           <w:rFonts w:ascii="Times New Roman" w:hAnsi="Times New Roman" w:cs="Times New Roman"/>
+          <w:noProof/>
         </w:rPr>
         <w:drawing>
           <wp:inline distT="0" distB="0" distL="0" distR="0" wp14:anchorId="261B4CDC" wp14:editId="6D76A146">
@@ -8371,7 +8399,7 @@
                     <pic:cNvPicPr/>
                   </pic:nvPicPr>
                   <pic:blipFill>
-                    <a:blip r:embed="rId10"/>
+                    <a:blip r:embed="rId19"/>
                     <a:stretch>
                       <a:fillRect/>
                     </a:stretch>
@@ -8401,6 +8429,7 @@
       <w:r>
         <w:rPr>
           <w:rFonts w:ascii="Times New Roman" w:hAnsi="Times New Roman" w:cs="Times New Roman"/>
+          <w:noProof/>
         </w:rPr>
         <w:drawing>
           <wp:inline distT="0" distB="0" distL="0" distR="0" wp14:anchorId="614F5DD5" wp14:editId="7211AC30">
@@ -8418,7 +8447,7 @@
                     <pic:cNvPicPr/>
                   </pic:nvPicPr>
                   <pic:blipFill>
-                    <a:blip r:embed="rId11"/>
+                    <a:blip r:embed="rId20"/>
                     <a:stretch>
                       <a:fillRect/>
                     </a:stretch>
@@ -8448,6 +8477,7 @@
       <w:r>
         <w:rPr>
           <w:rFonts w:ascii="Times New Roman" w:hAnsi="Times New Roman" w:cs="Times New Roman"/>
+          <w:noProof/>
         </w:rPr>
         <w:lastRenderedPageBreak/>
         <w:drawing>
@@ -8466,7 +8496,7 @@
                     <pic:cNvPicPr/>
                   </pic:nvPicPr>
                   <pic:blipFill>
-                    <a:blip r:embed="rId12"/>
+                    <a:blip r:embed="rId21"/>
                     <a:stretch>
                       <a:fillRect/>
                     </a:stretch>
@@ -8509,6 +8539,7 @@
       <w:r>
         <w:rPr>
           <w:rFonts w:ascii="Times New Roman" w:hAnsi="Times New Roman" w:cs="Times New Roman"/>
+          <w:noProof/>
         </w:rPr>
         <w:lastRenderedPageBreak/>
         <w:drawing>
@@ -8527,7 +8558,7 @@
                     <pic:cNvPicPr/>
                   </pic:nvPicPr>
                   <pic:blipFill>
-                    <a:blip r:embed="rId13"/>
+                    <a:blip r:embed="rId22"/>
                     <a:stretch>
                       <a:fillRect/>
                     </a:stretch>
@@ -8557,6 +8588,7 @@
       <w:r>
         <w:rPr>
           <w:rFonts w:ascii="Times New Roman" w:hAnsi="Times New Roman" w:cs="Times New Roman"/>
+          <w:noProof/>
         </w:rPr>
         <w:drawing>
           <wp:inline distT="0" distB="0" distL="0" distR="0" wp14:anchorId="734A738E" wp14:editId="602D6DB8">
@@ -8574,7 +8606,7 @@
                     <pic:cNvPicPr/>
                   </pic:nvPicPr>
                   <pic:blipFill>
-                    <a:blip r:embed="rId14"/>
+                    <a:blip r:embed="rId23"/>
                     <a:stretch>
                       <a:fillRect/>
                     </a:stretch>
@@ -8604,6 +8636,7 @@
       <w:r>
         <w:rPr>
           <w:rFonts w:ascii="Times New Roman" w:hAnsi="Times New Roman" w:cs="Times New Roman"/>
+          <w:noProof/>
         </w:rPr>
         <w:drawing>
           <wp:inline distT="0" distB="0" distL="0" distR="0" wp14:anchorId="1D052E1C" wp14:editId="19DBE694">
@@ -8621,7 +8654,7 @@
                     <pic:cNvPicPr/>
                   </pic:nvPicPr>
                   <pic:blipFill>
-                    <a:blip r:embed="rId15"/>
+                    <a:blip r:embed="rId24"/>
                     <a:stretch>
                       <a:fillRect/>
                     </a:stretch>
@@ -8720,6 +8753,7 @@
       <w:r>
         <w:rPr>
           <w:rFonts w:ascii="Times New Roman" w:hAnsi="Times New Roman" w:cs="Times New Roman"/>
+          <w:noProof/>
         </w:rPr>
         <w:drawing>
           <wp:inline distT="0" distB="0" distL="0" distR="0" wp14:anchorId="43BB1141" wp14:editId="2EC4EF62">
@@ -8737,7 +8771,7 @@
                     <pic:cNvPicPr/>
                   </pic:nvPicPr>
                   <pic:blipFill>
-                    <a:blip r:embed="rId16"/>
+                    <a:blip r:embed="rId25"/>
                     <a:stretch>
                       <a:fillRect/>
                     </a:stretch>
@@ -8767,6 +8801,7 @@
       <w:r>
         <w:rPr>
           <w:rFonts w:ascii="Times New Roman" w:hAnsi="Times New Roman" w:cs="Times New Roman"/>
+          <w:noProof/>
         </w:rPr>
         <w:drawing>
           <wp:inline distT="0" distB="0" distL="0" distR="0" wp14:anchorId="0B5F7D54" wp14:editId="7EEBE672">
@@ -8784,7 +8819,7 @@
                     <pic:cNvPicPr/>
                   </pic:nvPicPr>
                   <pic:blipFill>
-                    <a:blip r:embed="rId17"/>
+                    <a:blip r:embed="rId26"/>
                     <a:stretch>
                       <a:fillRect/>
                     </a:stretch>
@@ -9657,7 +9692,7 @@
         </w:rPr>
         <w:t>Acceder a la aplicación: </w:t>
       </w:r>
-      <w:hyperlink r:id="rId18" w:history="1">
+      <w:hyperlink r:id="rId27" w:history="1">
         <w:r>
           <w:rPr>
             <w:rStyle w:val="Hipervnculo"/>
@@ -19572,6 +19607,7 @@
       <w:r>
         <w:rPr>
           <w:rFonts w:ascii="Times New Roman" w:hAnsi="Times New Roman" w:cs="Times New Roman"/>
+          <w:noProof/>
         </w:rPr>
         <w:drawing>
           <wp:inline distT="0" distB="0" distL="0" distR="0" wp14:anchorId="5583B7D8" wp14:editId="5E7B7337">
@@ -19589,7 +19625,7 @@
                     <pic:cNvPicPr/>
                   </pic:nvPicPr>
                   <pic:blipFill>
-                    <a:blip r:embed="rId15"/>
+                    <a:blip r:embed="rId24"/>
                     <a:stretch>
                       <a:fillRect/>
                     </a:stretch>
@@ -20219,13 +20255,418 @@
       </w:pPr>
     </w:p>
     <w:sectPr>
+      <w:headerReference w:type="default" r:id="rId28"/>
+      <w:footerReference w:type="default" r:id="rId29"/>
       <w:pgSz w:w="11906" w:h="16838"/>
       <w:pgMar w:top="1417" w:right="1701" w:bottom="1417" w:left="1701" w:header="708" w:footer="708" w:gutter="0"/>
+      <w:pgNumType w:start="5"/>
       <w:cols w:space="708"/>
       <w:docGrid w:linePitch="360"/>
     </w:sectPr>
   </w:body>
 </w:document>
+</file>
+
+<file path=word/endnotes.xml><?xml version="1.0" encoding="utf-8"?>
+<w:endnotes xmlns:wpc="http://schemas.microsoft.com/office/word/2010/wordprocessingCanvas" xmlns:cx="http://schemas.microsoft.com/office/drawing/2014/chartex" xmlns:cx1="http://schemas.microsoft.com/office/drawing/2015/9/8/chartex" xmlns:cx2="http://schemas.microsoft.com/office/drawing/2015/10/21/chartex" xmlns:cx3="http://schemas.microsoft.com/office/drawing/2016/5/9/chartex" xmlns:cx4="http://schemas.microsoft.com/office/drawing/2016/5/10/chartex" xmlns:cx5="http://schemas.microsoft.com/office/drawing/2016/5/11/chartex" xmlns:cx6="http://schemas.microsoft.com/office/drawing/2016/5/12/chartex" xmlns:cx7="http://schemas.microsoft.com/office/drawing/2016/5/13/chartex" xmlns:cx8="http://schemas.microsoft.com/office/drawing/2016/5/14/chartex" xmlns:mc="http://schemas.openxmlformats.org/markup-compatibility/2006" xmlns:aink="http://schemas.microsoft.com/office/drawing/2016/ink" xmlns:am3d="http://schemas.microsoft.com/office/drawing/2017/model3d" xmlns:o="urn:schemas-microsoft-com:office:office" xmlns:oel="http://schemas.microsoft.com/office/2019/extlst" xmlns:r="http://schemas.openxmlformats.org/officeDocument/2006/relationships" xmlns:m="http://schemas.openxmlformats.org/officeDocument/2006/math" xmlns:v="urn:schemas-microsoft-com:vml" xmlns:wp14="http://schemas.microsoft.com/office/word/2010/wordprocessingDrawing" xmlns:wp="http://schemas.openxmlformats.org/drawingml/2006/wordprocessingDrawing" xmlns:w10="urn:schemas-microsoft-com:office:word" xmlns:w="http://schemas.openxmlformats.org/wordprocessingml/2006/main" xmlns:w14="http://schemas.microsoft.com/office/word/2010/wordml" xmlns:w15="http://schemas.microsoft.com/office/word/2012/wordml" xmlns:w16cex="http://schemas.microsoft.com/office/word/2018/wordml/cex" xmlns:w16cid="http://schemas.microsoft.com/office/word/2016/wordml/cid" xmlns:w16="http://schemas.microsoft.com/office/word/2018/wordml" xmlns:w16du="http://schemas.microsoft.com/office/word/2023/wordml/word16du" xmlns:w16sdtdh="http://schemas.microsoft.com/office/word/2020/wordml/sdtdatahash" xmlns:w16sdtfl="http://schemas.microsoft.com/office/word/2024/wordml/sdtformatlock" xmlns:w16se="http://schemas.microsoft.com/office/word/2015/wordml/symex" xmlns:wpg="http://schemas.microsoft.com/office/word/2010/wordprocessingGroup" xmlns:wpi="http://schemas.microsoft.com/office/word/2010/wordprocessingInk" xmlns:wne="http://schemas.microsoft.com/office/word/2006/wordml" xmlns:wps="http://schemas.microsoft.com/office/word/2010/wordprocessingShape" mc:Ignorable="w14 w15 w16se w16cid w16 w16cex w16sdtdh w16sdtfl w16du wp14">
+  <w:endnote w:type="separator" w:id="-1">
+    <w:p>
+      <w:pPr>
+        <w:spacing w:after="0" w:line="240" w:lineRule="auto"/>
+      </w:pPr>
+      <w:r>
+        <w:separator/>
+      </w:r>
+    </w:p>
+  </w:endnote>
+  <w:endnote w:type="continuationSeparator" w:id="0">
+    <w:p>
+      <w:pPr>
+        <w:spacing w:after="0" w:line="240" w:lineRule="auto"/>
+      </w:pPr>
+      <w:r>
+        <w:continuationSeparator/>
+      </w:r>
+    </w:p>
+  </w:endnote>
+</w:endnotes>
+</file>
+
+<file path=word/footer1.xml><?xml version="1.0" encoding="utf-8"?>
+<w:ftr xmlns:wpc="http://schemas.microsoft.com/office/word/2010/wordprocessingCanvas" xmlns:cx="http://schemas.microsoft.com/office/drawing/2014/chartex" xmlns:cx1="http://schemas.microsoft.com/office/drawing/2015/9/8/chartex" xmlns:cx2="http://schemas.microsoft.com/office/drawing/2015/10/21/chartex" xmlns:cx3="http://schemas.microsoft.com/office/drawing/2016/5/9/chartex" xmlns:cx4="http://schemas.microsoft.com/office/drawing/2016/5/10/chartex" xmlns:cx5="http://schemas.microsoft.com/office/drawing/2016/5/11/chartex" xmlns:cx6="http://schemas.microsoft.com/office/drawing/2016/5/12/chartex" xmlns:cx7="http://schemas.microsoft.com/office/drawing/2016/5/13/chartex" xmlns:cx8="http://schemas.microsoft.com/office/drawing/2016/5/14/chartex" xmlns:mc="http://schemas.openxmlformats.org/markup-compatibility/2006" xmlns:aink="http://schemas.microsoft.com/office/drawing/2016/ink" xmlns:am3d="http://schemas.microsoft.com/office/drawing/2017/model3d" xmlns:o="urn:schemas-microsoft-com:office:office" xmlns:oel="http://schemas.microsoft.com/office/2019/extlst" xmlns:r="http://schemas.openxmlformats.org/officeDocument/2006/relationships" xmlns:m="http://schemas.openxmlformats.org/officeDocument/2006/math" xmlns:v="urn:schemas-microsoft-com:vml" xmlns:wp14="http://schemas.microsoft.com/office/word/2010/wordprocessingDrawing" xmlns:wp="http://schemas.openxmlformats.org/drawingml/2006/wordprocessingDrawing" xmlns:w10="urn:schemas-microsoft-com:office:word" xmlns:w="http://schemas.openxmlformats.org/wordprocessingml/2006/main" xmlns:w14="http://schemas.microsoft.com/office/word/2010/wordml" xmlns:w15="http://schemas.microsoft.com/office/word/2012/wordml" xmlns:w16cex="http://schemas.microsoft.com/office/word/2018/wordml/cex" xmlns:w16cid="http://schemas.microsoft.com/office/word/2016/wordml/cid" xmlns:w16="http://schemas.microsoft.com/office/word/2018/wordml" xmlns:w16du="http://schemas.microsoft.com/office/word/2023/wordml/word16du" xmlns:w16sdtdh="http://schemas.microsoft.com/office/word/2020/wordml/sdtdatahash" xmlns:w16sdtfl="http://schemas.microsoft.com/office/word/2024/wordml/sdtformatlock" xmlns:w16se="http://schemas.microsoft.com/office/word/2015/wordml/symex" xmlns:wpg="http://schemas.microsoft.com/office/word/2010/wordprocessingGroup" xmlns:wpi="http://schemas.microsoft.com/office/word/2010/wordprocessingInk" xmlns:wne="http://schemas.microsoft.com/office/word/2006/wordml" xmlns:wps="http://schemas.microsoft.com/office/word/2010/wordprocessingShape" mc:Ignorable="w14 w15 w16se w16cid w16 w16cex w16sdtdh w16sdtfl w16du wp14">
+  <w:p>
+    <w:pPr>
+      <w:pStyle w:val="Piedepgina"/>
+    </w:pPr>
+  </w:p>
+</w:ftr>
+</file>
+
+<file path=word/footer2.xml><?xml version="1.0" encoding="utf-8"?>
+<w:ftr xmlns:wpc="http://schemas.microsoft.com/office/word/2010/wordprocessingCanvas" xmlns:cx="http://schemas.microsoft.com/office/drawing/2014/chartex" xmlns:cx1="http://schemas.microsoft.com/office/drawing/2015/9/8/chartex" xmlns:cx2="http://schemas.microsoft.com/office/drawing/2015/10/21/chartex" xmlns:cx3="http://schemas.microsoft.com/office/drawing/2016/5/9/chartex" xmlns:cx4="http://schemas.microsoft.com/office/drawing/2016/5/10/chartex" xmlns:cx5="http://schemas.microsoft.com/office/drawing/2016/5/11/chartex" xmlns:cx6="http://schemas.microsoft.com/office/drawing/2016/5/12/chartex" xmlns:cx7="http://schemas.microsoft.com/office/drawing/2016/5/13/chartex" xmlns:cx8="http://schemas.microsoft.com/office/drawing/2016/5/14/chartex" xmlns:mc="http://schemas.openxmlformats.org/markup-compatibility/2006" xmlns:aink="http://schemas.microsoft.com/office/drawing/2016/ink" xmlns:am3d="http://schemas.microsoft.com/office/drawing/2017/model3d" xmlns:o="urn:schemas-microsoft-com:office:office" xmlns:oel="http://schemas.microsoft.com/office/2019/extlst" xmlns:r="http://schemas.openxmlformats.org/officeDocument/2006/relationships" xmlns:m="http://schemas.openxmlformats.org/officeDocument/2006/math" xmlns:v="urn:schemas-microsoft-com:vml" xmlns:wp14="http://schemas.microsoft.com/office/word/2010/wordprocessingDrawing" xmlns:wp="http://schemas.openxmlformats.org/drawingml/2006/wordprocessingDrawing" xmlns:w10="urn:schemas-microsoft-com:office:word" xmlns:w="http://schemas.openxmlformats.org/wordprocessingml/2006/main" xmlns:w14="http://schemas.microsoft.com/office/word/2010/wordml" xmlns:w15="http://schemas.microsoft.com/office/word/2012/wordml" xmlns:w16cex="http://schemas.microsoft.com/office/word/2018/wordml/cex" xmlns:w16cid="http://schemas.microsoft.com/office/word/2016/wordml/cid" xmlns:w16="http://schemas.microsoft.com/office/word/2018/wordml" xmlns:w16du="http://schemas.microsoft.com/office/word/2023/wordml/word16du" xmlns:w16sdtdh="http://schemas.microsoft.com/office/word/2020/wordml/sdtdatahash" xmlns:w16sdtfl="http://schemas.microsoft.com/office/word/2024/wordml/sdtformatlock" xmlns:w16se="http://schemas.microsoft.com/office/word/2015/wordml/symex" xmlns:wpg="http://schemas.microsoft.com/office/word/2010/wordprocessingGroup" xmlns:wpi="http://schemas.microsoft.com/office/word/2010/wordprocessingInk" xmlns:wne="http://schemas.microsoft.com/office/word/2006/wordml" xmlns:wps="http://schemas.microsoft.com/office/word/2010/wordprocessingShape" mc:Ignorable="w14 w15 w16se w16cid w16 w16cex w16sdtdh w16sdtfl w16du wp14">
+  <w:p>
+    <w:pPr>
+      <w:pStyle w:val="Piedepgina"/>
+    </w:pPr>
+  </w:p>
+</w:ftr>
+</file>
+
+<file path=word/footer3.xml><?xml version="1.0" encoding="utf-8"?>
+<w:ftr xmlns:wpc="http://schemas.microsoft.com/office/word/2010/wordprocessingCanvas" xmlns:cx="http://schemas.microsoft.com/office/drawing/2014/chartex" xmlns:cx1="http://schemas.microsoft.com/office/drawing/2015/9/8/chartex" xmlns:cx2="http://schemas.microsoft.com/office/drawing/2015/10/21/chartex" xmlns:cx3="http://schemas.microsoft.com/office/drawing/2016/5/9/chartex" xmlns:cx4="http://schemas.microsoft.com/office/drawing/2016/5/10/chartex" xmlns:cx5="http://schemas.microsoft.com/office/drawing/2016/5/11/chartex" xmlns:cx6="http://schemas.microsoft.com/office/drawing/2016/5/12/chartex" xmlns:cx7="http://schemas.microsoft.com/office/drawing/2016/5/13/chartex" xmlns:cx8="http://schemas.microsoft.com/office/drawing/2016/5/14/chartex" xmlns:mc="http://schemas.openxmlformats.org/markup-compatibility/2006" xmlns:aink="http://schemas.microsoft.com/office/drawing/2016/ink" xmlns:am3d="http://schemas.microsoft.com/office/drawing/2017/model3d" xmlns:o="urn:schemas-microsoft-com:office:office" xmlns:oel="http://schemas.microsoft.com/office/2019/extlst" xmlns:r="http://schemas.openxmlformats.org/officeDocument/2006/relationships" xmlns:m="http://schemas.openxmlformats.org/officeDocument/2006/math" xmlns:v="urn:schemas-microsoft-com:vml" xmlns:wp14="http://schemas.microsoft.com/office/word/2010/wordprocessingDrawing" xmlns:wp="http://schemas.openxmlformats.org/drawingml/2006/wordprocessingDrawing" xmlns:w10="urn:schemas-microsoft-com:office:word" xmlns:w="http://schemas.openxmlformats.org/wordprocessingml/2006/main" xmlns:w14="http://schemas.microsoft.com/office/word/2010/wordml" xmlns:w15="http://schemas.microsoft.com/office/word/2012/wordml" xmlns:w16cex="http://schemas.microsoft.com/office/word/2018/wordml/cex" xmlns:w16cid="http://schemas.microsoft.com/office/word/2016/wordml/cid" xmlns:w16="http://schemas.microsoft.com/office/word/2018/wordml" xmlns:w16du="http://schemas.microsoft.com/office/word/2023/wordml/word16du" xmlns:w16sdtdh="http://schemas.microsoft.com/office/word/2020/wordml/sdtdatahash" xmlns:w16sdtfl="http://schemas.microsoft.com/office/word/2024/wordml/sdtformatlock" xmlns:w16se="http://schemas.microsoft.com/office/word/2015/wordml/symex" xmlns:wpg="http://schemas.microsoft.com/office/word/2010/wordprocessingGroup" xmlns:wpi="http://schemas.microsoft.com/office/word/2010/wordprocessingInk" xmlns:wne="http://schemas.microsoft.com/office/word/2006/wordml" xmlns:wps="http://schemas.microsoft.com/office/word/2010/wordprocessingShape" mc:Ignorable="w14 w15 w16se w16cid w16 w16cex w16sdtdh w16sdtfl w16du wp14">
+  <w:p>
+    <w:pPr>
+      <w:pStyle w:val="Piedepgina"/>
+    </w:pPr>
+  </w:p>
+</w:ftr>
+</file>
+
+<file path=word/footer4.xml><?xml version="1.0" encoding="utf-8"?>
+<w:ftr xmlns:wpc="http://schemas.microsoft.com/office/word/2010/wordprocessingCanvas" xmlns:cx="http://schemas.microsoft.com/office/drawing/2014/chartex" xmlns:cx1="http://schemas.microsoft.com/office/drawing/2015/9/8/chartex" xmlns:cx2="http://schemas.microsoft.com/office/drawing/2015/10/21/chartex" xmlns:cx3="http://schemas.microsoft.com/office/drawing/2016/5/9/chartex" xmlns:cx4="http://schemas.microsoft.com/office/drawing/2016/5/10/chartex" xmlns:cx5="http://schemas.microsoft.com/office/drawing/2016/5/11/chartex" xmlns:cx6="http://schemas.microsoft.com/office/drawing/2016/5/12/chartex" xmlns:cx7="http://schemas.microsoft.com/office/drawing/2016/5/13/chartex" xmlns:cx8="http://schemas.microsoft.com/office/drawing/2016/5/14/chartex" xmlns:mc="http://schemas.openxmlformats.org/markup-compatibility/2006" xmlns:aink="http://schemas.microsoft.com/office/drawing/2016/ink" xmlns:am3d="http://schemas.microsoft.com/office/drawing/2017/model3d" xmlns:o="urn:schemas-microsoft-com:office:office" xmlns:oel="http://schemas.microsoft.com/office/2019/extlst" xmlns:r="http://schemas.openxmlformats.org/officeDocument/2006/relationships" xmlns:m="http://schemas.openxmlformats.org/officeDocument/2006/math" xmlns:v="urn:schemas-microsoft-com:vml" xmlns:wp14="http://schemas.microsoft.com/office/word/2010/wordprocessingDrawing" xmlns:wp="http://schemas.openxmlformats.org/drawingml/2006/wordprocessingDrawing" xmlns:w10="urn:schemas-microsoft-com:office:word" xmlns:w="http://schemas.openxmlformats.org/wordprocessingml/2006/main" xmlns:w14="http://schemas.microsoft.com/office/word/2010/wordml" xmlns:w15="http://schemas.microsoft.com/office/word/2012/wordml" xmlns:w16cex="http://schemas.microsoft.com/office/word/2018/wordml/cex" xmlns:w16cid="http://schemas.microsoft.com/office/word/2016/wordml/cid" xmlns:w16="http://schemas.microsoft.com/office/word/2018/wordml" xmlns:w16du="http://schemas.microsoft.com/office/word/2023/wordml/word16du" xmlns:w16sdtdh="http://schemas.microsoft.com/office/word/2020/wordml/sdtdatahash" xmlns:w16sdtfl="http://schemas.microsoft.com/office/word/2024/wordml/sdtformatlock" xmlns:w16se="http://schemas.microsoft.com/office/word/2015/wordml/symex" xmlns:wpg="http://schemas.microsoft.com/office/word/2010/wordprocessingGroup" xmlns:wpi="http://schemas.microsoft.com/office/word/2010/wordprocessingInk" xmlns:wne="http://schemas.microsoft.com/office/word/2006/wordml" xmlns:wps="http://schemas.microsoft.com/office/word/2010/wordprocessingShape" mc:Ignorable="w14 w15 w16se w16cid w16 w16cex w16sdtdh w16sdtfl w16du wp14">
+  <w:sdt>
+    <w:sdtPr>
+      <w:id w:val="-1165706886"/>
+      <w:docPartObj>
+        <w:docPartGallery w:val="Page Numbers (Bottom of Page)"/>
+        <w:docPartUnique/>
+      </w:docPartObj>
+    </w:sdtPr>
+    <w:sdtContent>
+      <w:p>
+        <w:pPr>
+          <w:pStyle w:val="Piedepgina"/>
+        </w:pPr>
+        <w:r>
+          <w:rPr>
+            <w:noProof/>
+          </w:rPr>
+          <mc:AlternateContent>
+            <mc:Choice Requires="wpg">
+              <w:drawing>
+                <wp:anchor distT="0" distB="0" distL="114300" distR="114300" simplePos="0" relativeHeight="251659264" behindDoc="0" locked="0" layoutInCell="1" allowOverlap="1" wp14:anchorId="15FA0CC6" wp14:editId="68956B07">
+                  <wp:simplePos x="0" y="0"/>
+                  <wp:positionH relativeFrom="page">
+                    <wp:align>center</wp:align>
+                  </wp:positionH>
+                  <wp:positionV relativeFrom="bottomMargin">
+                    <wp:align>center</wp:align>
+                  </wp:positionV>
+                  <wp:extent cx="7753350" cy="190500"/>
+                  <wp:effectExtent l="9525" t="9525" r="9525" b="0"/>
+                  <wp:wrapNone/>
+                  <wp:docPr id="1563439109" name="Grupo 4"/>
+                  <wp:cNvGraphicFramePr>
+                    <a:graphicFrameLocks xmlns:a="http://schemas.openxmlformats.org/drawingml/2006/main"/>
+                  </wp:cNvGraphicFramePr>
+                  <a:graphic xmlns:a="http://schemas.openxmlformats.org/drawingml/2006/main">
+                    <a:graphicData uri="http://schemas.microsoft.com/office/word/2010/wordprocessingGroup">
+                      <wpg:wgp>
+                        <wpg:cNvGrpSpPr>
+                          <a:grpSpLocks/>
+                        </wpg:cNvGrpSpPr>
+                        <wpg:grpSpPr bwMode="auto">
+                          <a:xfrm>
+                            <a:off x="0" y="0"/>
+                            <a:ext cx="7753350" cy="190500"/>
+                            <a:chOff x="0" y="14970"/>
+                            <a:chExt cx="12255" cy="300"/>
+                          </a:xfrm>
+                        </wpg:grpSpPr>
+                        <wps:wsp>
+                          <wps:cNvPr id="1024602180" name="Text Box 25"/>
+                          <wps:cNvSpPr txBox="1">
+                            <a:spLocks noChangeArrowheads="1"/>
+                          </wps:cNvSpPr>
+                          <wps:spPr bwMode="auto">
+                            <a:xfrm>
+                              <a:off x="10803" y="14982"/>
+                              <a:ext cx="659" cy="288"/>
+                            </a:xfrm>
+                            <a:prstGeom prst="rect">
+                              <a:avLst/>
+                            </a:prstGeom>
+                            <a:noFill/>
+                            <a:ln>
+                              <a:noFill/>
+                            </a:ln>
+                            <a:extLst>
+                              <a:ext uri="{909E8E84-426E-40DD-AFC4-6F175D3DCCD1}">
+                                <a14:hiddenFill xmlns:a14="http://schemas.microsoft.com/office/drawing/2010/main">
+                                  <a:solidFill>
+                                    <a:srgbClr val="FFFFFF"/>
+                                  </a:solidFill>
+                                </a14:hiddenFill>
+                              </a:ext>
+                              <a:ext uri="{91240B29-F687-4F45-9708-019B960494DF}">
+                                <a14:hiddenLine xmlns:a14="http://schemas.microsoft.com/office/drawing/2010/main" w="9525">
+                                  <a:solidFill>
+                                    <a:srgbClr val="000000"/>
+                                  </a:solidFill>
+                                  <a:miter lim="800000"/>
+                                  <a:headEnd/>
+                                  <a:tailEnd/>
+                                </a14:hiddenLine>
+                              </a:ext>
+                            </a:extLst>
+                          </wps:spPr>
+                          <wps:txbx>
+                            <w:txbxContent>
+                              <w:p>
+                                <w:pPr>
+                                  <w:jc w:val="center"/>
+                                </w:pPr>
+                                <w:r>
+                                  <w:fldChar w:fldCharType="begin"/>
+                                </w:r>
+                                <w:r>
+                                  <w:instrText>PAGE    \* MERGEFORMAT</w:instrText>
+                                </w:r>
+                                <w:r>
+                                  <w:fldChar w:fldCharType="separate"/>
+                                </w:r>
+                                <w:r>
+                                  <w:rPr>
+                                    <w:color w:val="8C8C8C" w:themeColor="background1" w:themeShade="8C"/>
+                                  </w:rPr>
+                                  <w:t>2</w:t>
+                                </w:r>
+                                <w:r>
+                                  <w:rPr>
+                                    <w:color w:val="8C8C8C" w:themeColor="background1" w:themeShade="8C"/>
+                                  </w:rPr>
+                                  <w:fldChar w:fldCharType="end"/>
+                                </w:r>
+                              </w:p>
+                            </w:txbxContent>
+                          </wps:txbx>
+                          <wps:bodyPr rot="0" vert="horz" wrap="square" lIns="0" tIns="0" rIns="0" bIns="0" anchor="t" anchorCtr="0" upright="1">
+                            <a:noAutofit/>
+                          </wps:bodyPr>
+                        </wps:wsp>
+                        <wpg:grpSp>
+                          <wpg:cNvPr id="988141388" name="Group 31"/>
+                          <wpg:cNvGrpSpPr>
+                            <a:grpSpLocks/>
+                          </wpg:cNvGrpSpPr>
+                          <wpg:grpSpPr bwMode="auto">
+                            <a:xfrm flipH="1">
+                              <a:off x="0" y="14970"/>
+                              <a:ext cx="12255" cy="230"/>
+                              <a:chOff x="-8" y="14978"/>
+                              <a:chExt cx="12255" cy="230"/>
+                            </a:xfrm>
+                          </wpg:grpSpPr>
+                          <wps:wsp>
+                            <wps:cNvPr id="526550924" name="AutoShape 27"/>
+                            <wps:cNvCnPr>
+                              <a:cxnSpLocks noChangeShapeType="1"/>
+                            </wps:cNvCnPr>
+                            <wps:spPr bwMode="auto">
+                              <a:xfrm flipV="1">
+                                <a:off x="-8" y="14978"/>
+                                <a:ext cx="1260" cy="230"/>
+                              </a:xfrm>
+                              <a:prstGeom prst="bentConnector3">
+                                <a:avLst>
+                                  <a:gd name="adj1" fmla="val 50000"/>
+                                </a:avLst>
+                              </a:prstGeom>
+                              <a:noFill/>
+                              <a:ln w="9525">
+                                <a:solidFill>
+                                  <a:srgbClr val="A5A5A5"/>
+                                </a:solidFill>
+                                <a:miter lim="800000"/>
+                                <a:headEnd/>
+                                <a:tailEnd/>
+                              </a:ln>
+                              <a:extLst>
+                                <a:ext uri="{909E8E84-426E-40DD-AFC4-6F175D3DCCD1}">
+                                  <a14:hiddenFill xmlns:a14="http://schemas.microsoft.com/office/drawing/2010/main">
+                                    <a:noFill/>
+                                  </a14:hiddenFill>
+                                </a:ext>
+                              </a:extLst>
+                            </wps:spPr>
+                            <wps:bodyPr/>
+                          </wps:wsp>
+                          <wps:wsp>
+                            <wps:cNvPr id="1142016343" name="AutoShape 28"/>
+                            <wps:cNvCnPr>
+                              <a:cxnSpLocks noChangeShapeType="1"/>
+                            </wps:cNvCnPr>
+                            <wps:spPr bwMode="auto">
+                              <a:xfrm rot="10800000">
+                                <a:off x="1252" y="14978"/>
+                                <a:ext cx="10995" cy="230"/>
+                              </a:xfrm>
+                              <a:prstGeom prst="bentConnector3">
+                                <a:avLst>
+                                  <a:gd name="adj1" fmla="val 96778"/>
+                                </a:avLst>
+                              </a:prstGeom>
+                              <a:noFill/>
+                              <a:ln w="9525">
+                                <a:solidFill>
+                                  <a:srgbClr val="A5A5A5"/>
+                                </a:solidFill>
+                                <a:miter lim="800000"/>
+                                <a:headEnd/>
+                                <a:tailEnd/>
+                              </a:ln>
+                              <a:extLst>
+                                <a:ext uri="{909E8E84-426E-40DD-AFC4-6F175D3DCCD1}">
+                                  <a14:hiddenFill xmlns:a14="http://schemas.microsoft.com/office/drawing/2010/main">
+                                    <a:noFill/>
+                                  </a14:hiddenFill>
+                                </a:ext>
+                              </a:extLst>
+                            </wps:spPr>
+                            <wps:bodyPr/>
+                          </wps:wsp>
+                        </wpg:grpSp>
+                      </wpg:wgp>
+                    </a:graphicData>
+                  </a:graphic>
+                  <wp14:sizeRelH relativeFrom="page">
+                    <wp14:pctWidth>100000</wp14:pctWidth>
+                  </wp14:sizeRelH>
+                  <wp14:sizeRelV relativeFrom="page">
+                    <wp14:pctHeight>0</wp14:pctHeight>
+                  </wp14:sizeRelV>
+                </wp:anchor>
+              </w:drawing>
+            </mc:Choice>
+            <mc:Fallback>
+              <w:pict>
+                <v:group w14:anchorId="15FA0CC6" id="Grupo 4" o:spid="_x0000_s1026" style="position:absolute;margin-left:0;margin-top:0;width:610.5pt;height:15pt;z-index:251659264;mso-width-percent:1000;mso-position-horizontal:center;mso-position-horizontal-relative:page;mso-position-vertical:center;mso-position-vertical-relative:bottom-margin-area;mso-width-percent:1000" coordorigin=",14970" coordsize="12255,300" o:gfxdata="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">
+                  <v:shapetype id="_x0000_t202" coordsize="21600,21600" o:spt="202" path="m,l,21600r21600,l21600,xe">
+                    <v:stroke joinstyle="miter"/>
+                    <v:path gradientshapeok="t" o:connecttype="rect"/>
+                  </v:shapetype>
+                  <v:shape id="Text Box 25" o:spid="_x0000_s1027" type="#_x0000_t202" style="position:absolute;left:10803;top:14982;width:659;height:288;visibility:visible;mso-wrap-style:square;v-text-anchor:top" o:gfxdata="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" filled="f" stroked="f">
+                    <v:textbox inset="0,0,0,0">
+                      <w:txbxContent>
+                        <w:p>
+                          <w:pPr>
+                            <w:jc w:val="center"/>
+                          </w:pPr>
+                          <w:r>
+                            <w:fldChar w:fldCharType="begin"/>
+                          </w:r>
+                          <w:r>
+                            <w:instrText>PAGE    \* MERGEFORMAT</w:instrText>
+                          </w:r>
+                          <w:r>
+                            <w:fldChar w:fldCharType="separate"/>
+                          </w:r>
+                          <w:r>
+                            <w:rPr>
+                              <w:color w:val="8C8C8C" w:themeColor="background1" w:themeShade="8C"/>
+                            </w:rPr>
+                            <w:t>2</w:t>
+                          </w:r>
+                          <w:r>
+                            <w:rPr>
+                              <w:color w:val="8C8C8C" w:themeColor="background1" w:themeShade="8C"/>
+                            </w:rPr>
+                            <w:fldChar w:fldCharType="end"/>
+                          </w:r>
+                        </w:p>
+                      </w:txbxContent>
+                    </v:textbox>
+                  </v:shape>
+                  <v:group id="Group 31" o:spid="_x0000_s1028" style="position:absolute;top:14970;width:12255;height:230;flip:x" coordorigin="-8,14978" coordsize="12255,230" o:gfxdata="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">
+                    <v:shapetype id="_x0000_t34" coordsize="21600,21600" o:spt="34" o:oned="t" adj="10800" path="m,l@0,0@0,21600,21600,21600e" filled="f">
+                      <v:stroke joinstyle="miter"/>
+                      <v:formulas>
+                        <v:f eqn="val #0"/>
+                      </v:formulas>
+                      <v:path arrowok="t" fillok="f" o:connecttype="none"/>
+                      <v:handles>
+                        <v:h position="#0,center"/>
+                      </v:handles>
+                      <o:lock v:ext="edit" shapetype="t"/>
+                    </v:shapetype>
+                    <v:shape id="AutoShape 27" o:spid="_x0000_s1029" type="#_x0000_t34" style="position:absolute;left:-8;top:14978;width:1260;height:230;flip:y;visibility:visible;mso-wrap-style:square" o:connectortype="elbow" o:gfxdata="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" strokecolor="#a5a5a5"/>
+                    <v:shape id="AutoShape 28" o:spid="_x0000_s1030" type="#_x0000_t34" style="position:absolute;left:1252;top:14978;width:10995;height:230;rotation:180;visibility:visible;mso-wrap-style:square" o:connectortype="elbow" o:gfxdata="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" adj="20904" strokecolor="#a5a5a5"/>
+                  </v:group>
+                  <w10:wrap anchorx="page" anchory="margin"/>
+                </v:group>
+              </w:pict>
+            </mc:Fallback>
+          </mc:AlternateContent>
+        </w:r>
+      </w:p>
+    </w:sdtContent>
+  </w:sdt>
+</w:ftr>
+</file>
+
+<file path=word/footnotes.xml><?xml version="1.0" encoding="utf-8"?>
+<w:footnotes xmlns:wpc="http://schemas.microsoft.com/office/word/2010/wordprocessingCanvas" xmlns:cx="http://schemas.microsoft.com/office/drawing/2014/chartex" xmlns:cx1="http://schemas.microsoft.com/office/drawing/2015/9/8/chartex" xmlns:cx2="http://schemas.microsoft.com/office/drawing/2015/10/21/chartex" xmlns:cx3="http://schemas.microsoft.com/office/drawing/2016/5/9/chartex" xmlns:cx4="http://schemas.microsoft.com/office/drawing/2016/5/10/chartex" xmlns:cx5="http://schemas.microsoft.com/office/drawing/2016/5/11/chartex" xmlns:cx6="http://schemas.microsoft.com/office/drawing/2016/5/12/chartex" xmlns:cx7="http://schemas.microsoft.com/office/drawing/2016/5/13/chartex" xmlns:cx8="http://schemas.microsoft.com/office/drawing/2016/5/14/chartex" xmlns:mc="http://schemas.openxmlformats.org/markup-compatibility/2006" xmlns:aink="http://schemas.microsoft.com/office/drawing/2016/ink" xmlns:am3d="http://schemas.microsoft.com/office/drawing/2017/model3d" xmlns:o="urn:schemas-microsoft-com:office:office" xmlns:oel="http://schemas.microsoft.com/office/2019/extlst" xmlns:r="http://schemas.openxmlformats.org/officeDocument/2006/relationships" xmlns:m="http://schemas.openxmlformats.org/officeDocument/2006/math" xmlns:v="urn:schemas-microsoft-com:vml" xmlns:wp14="http://schemas.microsoft.com/office/word/2010/wordprocessingDrawing" xmlns:wp="http://schemas.openxmlformats.org/drawingml/2006/wordprocessingDrawing" xmlns:w10="urn:schemas-microsoft-com:office:word" xmlns:w="http://schemas.openxmlformats.org/wordprocessingml/2006/main" xmlns:w14="http://schemas.microsoft.com/office/word/2010/wordml" xmlns:w15="http://schemas.microsoft.com/office/word/2012/wordml" xmlns:w16cex="http://schemas.microsoft.com/office/word/2018/wordml/cex" xmlns:w16cid="http://schemas.microsoft.com/office/word/2016/wordml/cid" xmlns:w16="http://schemas.microsoft.com/office/word/2018/wordml" xmlns:w16du="http://schemas.microsoft.com/office/word/2023/wordml/word16du" xmlns:w16sdtdh="http://schemas.microsoft.com/office/word/2020/wordml/sdtdatahash" xmlns:w16sdtfl="http://schemas.microsoft.com/office/word/2024/wordml/sdtformatlock" xmlns:w16se="http://schemas.microsoft.com/office/word/2015/wordml/symex" xmlns:wpg="http://schemas.microsoft.com/office/word/2010/wordprocessingGroup" xmlns:wpi="http://schemas.microsoft.com/office/word/2010/wordprocessingInk" xmlns:wne="http://schemas.microsoft.com/office/word/2006/wordml" xmlns:wps="http://schemas.microsoft.com/office/word/2010/wordprocessingShape" mc:Ignorable="w14 w15 w16se w16cid w16 w16cex w16sdtdh w16sdtfl w16du wp14">
+  <w:footnote w:type="separator" w:id="-1">
+    <w:p>
+      <w:pPr>
+        <w:spacing w:after="0" w:line="240" w:lineRule="auto"/>
+      </w:pPr>
+      <w:r>
+        <w:separator/>
+      </w:r>
+    </w:p>
+  </w:footnote>
+  <w:footnote w:type="continuationSeparator" w:id="0">
+    <w:p>
+      <w:pPr>
+        <w:spacing w:after="0" w:line="240" w:lineRule="auto"/>
+      </w:pPr>
+      <w:r>
+        <w:continuationSeparator/>
+      </w:r>
+    </w:p>
+  </w:footnote>
+</w:footnotes>
+</file>
+
+<file path=word/header1.xml><?xml version="1.0" encoding="utf-8"?>
+<w:hdr xmlns:wpc="http://schemas.microsoft.com/office/word/2010/wordprocessingCanvas" xmlns:cx="http://schemas.microsoft.com/office/drawing/2014/chartex" xmlns:cx1="http://schemas.microsoft.com/office/drawing/2015/9/8/chartex" xmlns:cx2="http://schemas.microsoft.com/office/drawing/2015/10/21/chartex" xmlns:cx3="http://schemas.microsoft.com/office/drawing/2016/5/9/chartex" xmlns:cx4="http://schemas.microsoft.com/office/drawing/2016/5/10/chartex" xmlns:cx5="http://schemas.microsoft.com/office/drawing/2016/5/11/chartex" xmlns:cx6="http://schemas.microsoft.com/office/drawing/2016/5/12/chartex" xmlns:cx7="http://schemas.microsoft.com/office/drawing/2016/5/13/chartex" xmlns:cx8="http://schemas.microsoft.com/office/drawing/2016/5/14/chartex" xmlns:mc="http://schemas.openxmlformats.org/markup-compatibility/2006" xmlns:aink="http://schemas.microsoft.com/office/drawing/2016/ink" xmlns:am3d="http://schemas.microsoft.com/office/drawing/2017/model3d" xmlns:o="urn:schemas-microsoft-com:office:office" xmlns:oel="http://schemas.microsoft.com/office/2019/extlst" xmlns:r="http://schemas.openxmlformats.org/officeDocument/2006/relationships" xmlns:m="http://schemas.openxmlformats.org/officeDocument/2006/math" xmlns:v="urn:schemas-microsoft-com:vml" xmlns:wp14="http://schemas.microsoft.com/office/word/2010/wordprocessingDrawing" xmlns:wp="http://schemas.openxmlformats.org/drawingml/2006/wordprocessingDrawing" xmlns:w10="urn:schemas-microsoft-com:office:word" xmlns:w="http://schemas.openxmlformats.org/wordprocessingml/2006/main" xmlns:w14="http://schemas.microsoft.com/office/word/2010/wordml" xmlns:w15="http://schemas.microsoft.com/office/word/2012/wordml" xmlns:w16cex="http://schemas.microsoft.com/office/word/2018/wordml/cex" xmlns:w16cid="http://schemas.microsoft.com/office/word/2016/wordml/cid" xmlns:w16="http://schemas.microsoft.com/office/word/2018/wordml" xmlns:w16du="http://schemas.microsoft.com/office/word/2023/wordml/word16du" xmlns:w16sdtdh="http://schemas.microsoft.com/office/word/2020/wordml/sdtdatahash" xmlns:w16sdtfl="http://schemas.microsoft.com/office/word/2024/wordml/sdtformatlock" xmlns:w16se="http://schemas.microsoft.com/office/word/2015/wordml/symex" xmlns:wpg="http://schemas.microsoft.com/office/word/2010/wordprocessingGroup" xmlns:wpi="http://schemas.microsoft.com/office/word/2010/wordprocessingInk" xmlns:wne="http://schemas.microsoft.com/office/word/2006/wordml" xmlns:wps="http://schemas.microsoft.com/office/word/2010/wordprocessingShape" mc:Ignorable="w14 w15 w16se w16cid w16 w16cex w16sdtdh w16sdtfl w16du wp14">
+  <w:p>
+    <w:pPr>
+      <w:pStyle w:val="Encabezado"/>
+    </w:pPr>
+  </w:p>
+</w:hdr>
+</file>
+
+<file path=word/header2.xml><?xml version="1.0" encoding="utf-8"?>
+<w:hdr xmlns:wpc="http://schemas.microsoft.com/office/word/2010/wordprocessingCanvas" xmlns:cx="http://schemas.microsoft.com/office/drawing/2014/chartex" xmlns:cx1="http://schemas.microsoft.com/office/drawing/2015/9/8/chartex" xmlns:cx2="http://schemas.microsoft.com/office/drawing/2015/10/21/chartex" xmlns:cx3="http://schemas.microsoft.com/office/drawing/2016/5/9/chartex" xmlns:cx4="http://schemas.microsoft.com/office/drawing/2016/5/10/chartex" xmlns:cx5="http://schemas.microsoft.com/office/drawing/2016/5/11/chartex" xmlns:cx6="http://schemas.microsoft.com/office/drawing/2016/5/12/chartex" xmlns:cx7="http://schemas.microsoft.com/office/drawing/2016/5/13/chartex" xmlns:cx8="http://schemas.microsoft.com/office/drawing/2016/5/14/chartex" xmlns:mc="http://schemas.openxmlformats.org/markup-compatibility/2006" xmlns:aink="http://schemas.microsoft.com/office/drawing/2016/ink" xmlns:am3d="http://schemas.microsoft.com/office/drawing/2017/model3d" xmlns:o="urn:schemas-microsoft-com:office:office" xmlns:oel="http://schemas.microsoft.com/office/2019/extlst" xmlns:r="http://schemas.openxmlformats.org/officeDocument/2006/relationships" xmlns:m="http://schemas.openxmlformats.org/officeDocument/2006/math" xmlns:v="urn:schemas-microsoft-com:vml" xmlns:wp14="http://schemas.microsoft.com/office/word/2010/wordprocessingDrawing" xmlns:wp="http://schemas.openxmlformats.org/drawingml/2006/wordprocessingDrawing" xmlns:w10="urn:schemas-microsoft-com:office:word" xmlns:w="http://schemas.openxmlformats.org/wordprocessingml/2006/main" xmlns:w14="http://schemas.microsoft.com/office/word/2010/wordml" xmlns:w15="http://schemas.microsoft.com/office/word/2012/wordml" xmlns:w16cex="http://schemas.microsoft.com/office/word/2018/wordml/cex" xmlns:w16cid="http://schemas.microsoft.com/office/word/2016/wordml/cid" xmlns:w16="http://schemas.microsoft.com/office/word/2018/wordml" xmlns:w16du="http://schemas.microsoft.com/office/word/2023/wordml/word16du" xmlns:w16sdtdh="http://schemas.microsoft.com/office/word/2020/wordml/sdtdatahash" xmlns:w16sdtfl="http://schemas.microsoft.com/office/word/2024/wordml/sdtformatlock" xmlns:w16se="http://schemas.microsoft.com/office/word/2015/wordml/symex" xmlns:wpg="http://schemas.microsoft.com/office/word/2010/wordprocessingGroup" xmlns:wpi="http://schemas.microsoft.com/office/word/2010/wordprocessingInk" xmlns:wne="http://schemas.microsoft.com/office/word/2006/wordml" xmlns:wps="http://schemas.microsoft.com/office/word/2010/wordprocessingShape" mc:Ignorable="w14 w15 w16se w16cid w16 w16cex w16sdtdh w16sdtfl w16du wp14">
+  <w:p>
+    <w:pPr>
+      <w:pStyle w:val="Encabezado"/>
+    </w:pPr>
+  </w:p>
+</w:hdr>
+</file>
+
+<file path=word/header3.xml><?xml version="1.0" encoding="utf-8"?>
+<w:hdr xmlns:wpc="http://schemas.microsoft.com/office/word/2010/wordprocessingCanvas" xmlns:cx="http://schemas.microsoft.com/office/drawing/2014/chartex" xmlns:cx1="http://schemas.microsoft.com/office/drawing/2015/9/8/chartex" xmlns:cx2="http://schemas.microsoft.com/office/drawing/2015/10/21/chartex" xmlns:cx3="http://schemas.microsoft.com/office/drawing/2016/5/9/chartex" xmlns:cx4="http://schemas.microsoft.com/office/drawing/2016/5/10/chartex" xmlns:cx5="http://schemas.microsoft.com/office/drawing/2016/5/11/chartex" xmlns:cx6="http://schemas.microsoft.com/office/drawing/2016/5/12/chartex" xmlns:cx7="http://schemas.microsoft.com/office/drawing/2016/5/13/chartex" xmlns:cx8="http://schemas.microsoft.com/office/drawing/2016/5/14/chartex" xmlns:mc="http://schemas.openxmlformats.org/markup-compatibility/2006" xmlns:aink="http://schemas.microsoft.com/office/drawing/2016/ink" xmlns:am3d="http://schemas.microsoft.com/office/drawing/2017/model3d" xmlns:o="urn:schemas-microsoft-com:office:office" xmlns:oel="http://schemas.microsoft.com/office/2019/extlst" xmlns:r="http://schemas.openxmlformats.org/officeDocument/2006/relationships" xmlns:m="http://schemas.openxmlformats.org/officeDocument/2006/math" xmlns:v="urn:schemas-microsoft-com:vml" xmlns:wp14="http://schemas.microsoft.com/office/word/2010/wordprocessingDrawing" xmlns:wp="http://schemas.openxmlformats.org/drawingml/2006/wordprocessingDrawing" xmlns:w10="urn:schemas-microsoft-com:office:word" xmlns:w="http://schemas.openxmlformats.org/wordprocessingml/2006/main" xmlns:w14="http://schemas.microsoft.com/office/word/2010/wordml" xmlns:w15="http://schemas.microsoft.com/office/word/2012/wordml" xmlns:w16cex="http://schemas.microsoft.com/office/word/2018/wordml/cex" xmlns:w16cid="http://schemas.microsoft.com/office/word/2016/wordml/cid" xmlns:w16="http://schemas.microsoft.com/office/word/2018/wordml" xmlns:w16du="http://schemas.microsoft.com/office/word/2023/wordml/word16du" xmlns:w16sdtdh="http://schemas.microsoft.com/office/word/2020/wordml/sdtdatahash" xmlns:w16sdtfl="http://schemas.microsoft.com/office/word/2024/wordml/sdtformatlock" xmlns:w16se="http://schemas.microsoft.com/office/word/2015/wordml/symex" xmlns:wpg="http://schemas.microsoft.com/office/word/2010/wordprocessingGroup" xmlns:wpi="http://schemas.microsoft.com/office/word/2010/wordprocessingInk" xmlns:wne="http://schemas.microsoft.com/office/word/2006/wordml" xmlns:wps="http://schemas.microsoft.com/office/word/2010/wordprocessingShape" mc:Ignorable="w14 w15 w16se w16cid w16 w16cex w16sdtdh w16sdtfl w16du wp14">
+  <w:p>
+    <w:pPr>
+      <w:pStyle w:val="Encabezado"/>
+    </w:pPr>
+  </w:p>
+</w:hdr>
+</file>
+
+<file path=word/header4.xml><?xml version="1.0" encoding="utf-8"?>
+<w:hdr xmlns:wpc="http://schemas.microsoft.com/office/word/2010/wordprocessingCanvas" xmlns:cx="http://schemas.microsoft.com/office/drawing/2014/chartex" xmlns:cx1="http://schemas.microsoft.com/office/drawing/2015/9/8/chartex" xmlns:cx2="http://schemas.microsoft.com/office/drawing/2015/10/21/chartex" xmlns:cx3="http://schemas.microsoft.com/office/drawing/2016/5/9/chartex" xmlns:cx4="http://schemas.microsoft.com/office/drawing/2016/5/10/chartex" xmlns:cx5="http://schemas.microsoft.com/office/drawing/2016/5/11/chartex" xmlns:cx6="http://schemas.microsoft.com/office/drawing/2016/5/12/chartex" xmlns:cx7="http://schemas.microsoft.com/office/drawing/2016/5/13/chartex" xmlns:cx8="http://schemas.microsoft.com/office/drawing/2016/5/14/chartex" xmlns:mc="http://schemas.openxmlformats.org/markup-compatibility/2006" xmlns:aink="http://schemas.microsoft.com/office/drawing/2016/ink" xmlns:am3d="http://schemas.microsoft.com/office/drawing/2017/model3d" xmlns:o="urn:schemas-microsoft-com:office:office" xmlns:oel="http://schemas.microsoft.com/office/2019/extlst" xmlns:r="http://schemas.openxmlformats.org/officeDocument/2006/relationships" xmlns:m="http://schemas.openxmlformats.org/officeDocument/2006/math" xmlns:v="urn:schemas-microsoft-com:vml" xmlns:wp14="http://schemas.microsoft.com/office/word/2010/wordprocessingDrawing" xmlns:wp="http://schemas.openxmlformats.org/drawingml/2006/wordprocessingDrawing" xmlns:w10="urn:schemas-microsoft-com:office:word" xmlns:w="http://schemas.openxmlformats.org/wordprocessingml/2006/main" xmlns:w14="http://schemas.microsoft.com/office/word/2010/wordml" xmlns:w15="http://schemas.microsoft.com/office/word/2012/wordml" xmlns:w16cex="http://schemas.microsoft.com/office/word/2018/wordml/cex" xmlns:w16cid="http://schemas.microsoft.com/office/word/2016/wordml/cid" xmlns:w16="http://schemas.microsoft.com/office/word/2018/wordml" xmlns:w16du="http://schemas.microsoft.com/office/word/2023/wordml/word16du" xmlns:w16sdtdh="http://schemas.microsoft.com/office/word/2020/wordml/sdtdatahash" xmlns:w16sdtfl="http://schemas.microsoft.com/office/word/2024/wordml/sdtformatlock" xmlns:w16se="http://schemas.microsoft.com/office/word/2015/wordml/symex" xmlns:wpg="http://schemas.microsoft.com/office/word/2010/wordprocessingGroup" xmlns:wpi="http://schemas.microsoft.com/office/word/2010/wordprocessingInk" xmlns:wne="http://schemas.microsoft.com/office/word/2006/wordml" xmlns:wps="http://schemas.microsoft.com/office/word/2010/wordprocessingShape" mc:Ignorable="w14 w15 w16se w16cid w16 w16cex w16sdtdh w16sdtfl w16du wp14">
+  <w:p>
+    <w:pPr>
+      <w:pStyle w:val="Encabezado"/>
+    </w:pPr>
+  </w:p>
+</w:hdr>
 </file>
 
 <file path=word/numbering.xml><?xml version="1.0" encoding="utf-8"?>
@@ -26823,6 +27264,7 @@
   <w:style w:type="character" w:default="1" w:styleId="Fuentedeprrafopredeter">
     <w:name w:val="Default Paragraph Font"/>
     <w:uiPriority w:val="1"/>
+    <w:semiHidden/>
     <w:unhideWhenUsed/>
   </w:style>
   <w:style w:type="table" w:default="1" w:styleId="Tablanormal">
@@ -27283,6 +27725,83 @@
       <w:shd w:val="clear" w:color="auto" w:fill="E1DFDD"/>
     </w:rPr>
   </w:style>
+  <w:style w:type="paragraph" w:styleId="Encabezado">
+    <w:name w:val="header"/>
+    <w:basedOn w:val="Normal"/>
+    <w:link w:val="EncabezadoCar"/>
+    <w:uiPriority w:val="99"/>
+    <w:unhideWhenUsed/>
+    <w:rsid w:val="006E53A0"/>
+    <w:pPr>
+      <w:tabs>
+        <w:tab w:val="center" w:pos="4252"/>
+        <w:tab w:val="right" w:pos="8504"/>
+      </w:tabs>
+      <w:spacing w:after="0" w:line="240" w:lineRule="auto"/>
+    </w:pPr>
+  </w:style>
+  <w:style w:type="character" w:customStyle="1" w:styleId="EncabezadoCar">
+    <w:name w:val="Encabezado Car"/>
+    <w:basedOn w:val="Fuentedeprrafopredeter"/>
+    <w:link w:val="Encabezado"/>
+    <w:uiPriority w:val="99"/>
+    <w:rsid w:val="006E53A0"/>
+  </w:style>
+  <w:style w:type="paragraph" w:styleId="Piedepgina">
+    <w:name w:val="footer"/>
+    <w:basedOn w:val="Normal"/>
+    <w:link w:val="PiedepginaCar"/>
+    <w:uiPriority w:val="99"/>
+    <w:unhideWhenUsed/>
+    <w:rsid w:val="006E53A0"/>
+    <w:pPr>
+      <w:tabs>
+        <w:tab w:val="center" w:pos="4252"/>
+        <w:tab w:val="right" w:pos="8504"/>
+      </w:tabs>
+      <w:spacing w:after="0" w:line="240" w:lineRule="auto"/>
+    </w:pPr>
+  </w:style>
+  <w:style w:type="character" w:customStyle="1" w:styleId="PiedepginaCar">
+    <w:name w:val="Pie de página Car"/>
+    <w:basedOn w:val="Fuentedeprrafopredeter"/>
+    <w:link w:val="Piedepgina"/>
+    <w:uiPriority w:val="99"/>
+    <w:rsid w:val="006E53A0"/>
+  </w:style>
+  <w:style w:type="paragraph" w:styleId="Sinespaciado">
+    <w:name w:val="No Spacing"/>
+    <w:link w:val="SinespaciadoCar"/>
+    <w:uiPriority w:val="1"/>
+    <w:qFormat/>
+    <w:rsid w:val="006E53A0"/>
+    <w:pPr>
+      <w:spacing w:after="0" w:line="240" w:lineRule="auto"/>
+    </w:pPr>
+    <w:rPr>
+      <w:rFonts w:eastAsiaTheme="minorEastAsia"/>
+      <w:kern w:val="0"/>
+      <w:sz w:val="22"/>
+      <w:szCs w:val="22"/>
+      <w:lang w:eastAsia="es-ES"/>
+      <w14:ligatures w14:val="none"/>
+    </w:rPr>
+  </w:style>
+  <w:style w:type="character" w:customStyle="1" w:styleId="SinespaciadoCar">
+    <w:name w:val="Sin espaciado Car"/>
+    <w:basedOn w:val="Fuentedeprrafopredeter"/>
+    <w:link w:val="Sinespaciado"/>
+    <w:uiPriority w:val="1"/>
+    <w:rsid w:val="006E53A0"/>
+    <w:rPr>
+      <w:rFonts w:eastAsiaTheme="minorEastAsia"/>
+      <w:kern w:val="0"/>
+      <w:sz w:val="22"/>
+      <w:szCs w:val="22"/>
+      <w:lang w:eastAsia="es-ES"/>
+      <w14:ligatures w14:val="none"/>
+    </w:rPr>
+  </w:style>
 </w:styles>
 </file>
 
@@ -27579,4 +28098,16 @@
     </a:ext>
   </a:extLst>
 </a:theme>
+</file>
+
+<file path=customXml/item1.xml><?xml version="1.0" encoding="utf-8"?>
+<b:Sources xmlns:b="http://schemas.openxmlformats.org/officeDocument/2006/bibliography" xmlns="http://schemas.openxmlformats.org/officeDocument/2006/bibliography" SelectedStyle="\APASixthEditionOfficeOnline.xsl" StyleName="APA" Version="6"/>
+</file>
+
+<file path=customXml/itemProps1.xml><?xml version="1.0" encoding="utf-8"?>
+<ds:datastoreItem xmlns:ds="http://schemas.openxmlformats.org/officeDocument/2006/customXml" ds:itemID="{49F4701A-D99D-46A8-A705-1A5FD3D683F0}">
+  <ds:schemaRefs>
+    <ds:schemaRef ds:uri="http://schemas.openxmlformats.org/officeDocument/2006/bibliography"/>
+  </ds:schemaRefs>
+</ds:datastoreItem>
 </file>
</xml_diff>